<commit_message>
Remove personal names, anonymize all documents
</commit_message>
<xml_diff>
--- a/articulo 3/articulo_SVAR_scopus.docx
+++ b/articulo 3/articulo_SVAR_scopus.docx
@@ -55,7 +55,7 @@
           <w:i w:val="0"/>
           <w:sz w:val="22"/>
         </w:rPr>
-        <w:t>Renzo Gael Mamani Quispe</w:t>
+        <w:t>[Autor 1]</w:t>
       </w:r>
       <w:r>
         <w:rPr>
@@ -82,7 +82,7 @@
           <w:i w:val="0"/>
           <w:sz w:val="22"/>
         </w:rPr>
-        <w:t>Alfredo Pelayo Calatayud Mendoza</w:t>
+        <w:t>[Autor 2]</w:t>
       </w:r>
       <w:r>
         <w:rPr>
@@ -109,7 +109,7 @@
           <w:i w:val="0"/>
           <w:sz w:val="22"/>
         </w:rPr>
-        <w:t>José Carlos Machicao Mamani</w:t>
+        <w:t>[Autor 3]</w:t>
       </w:r>
       <w:r>
         <w:rPr>
@@ -236,7 +236,7 @@
           <w:i/>
           <w:sz w:val="20"/>
         </w:rPr>
-        <w:t>renzomamani@example.com</w:t>
+        <w:t>[email@example.com]</w:t>
       </w:r>
     </w:p>
     <w:p>

</xml_diff>